<commit_message>
inserisco icona soldi per app pagati
</commit_message>
<xml_diff>
--- a/VaiMUp_MANUALE UTENTE E GUIDA OPERATIVA_v2.docx
+++ b/VaiMUp_MANUALE UTENTE E GUIDA OPERATIVA_v2.docx
@@ -5068,18 +5068,7 @@
           <w:szCs w:val="21"/>
           <w:shd w:val="clear" w:color="auto" w:fill="FFFFFF"/>
         </w:rPr>
-        <w:t> nel menu laterale)</w:t>
-      </w:r>
-      <w:r>
-        <w:rPr>
-          <w:rStyle w:val="ng-star-inserted"/>
-          <w:rFonts w:ascii="Arial" w:hAnsi="Arial" w:cs="Arial"/>
-          <w:color w:val="1B1B1E"/>
-          <w:sz w:val="21"/>
-          <w:szCs w:val="21"/>
-          <w:shd w:val="clear" w:color="auto" w:fill="FFFFFF"/>
-        </w:rPr>
-        <w:t xml:space="preserve"> </w:t>
+        <w:t xml:space="preserve"> nel menu laterale) </w:t>
       </w:r>
       <w:r>
         <w:rPr>
@@ -8898,7 +8887,59 @@
           <w:sz w:val="21"/>
           <w:szCs w:val="21"/>
         </w:rPr>
-        <w:t xml:space="preserve"> Una volta inviata la conferma o il promemoria, l'appuntamento in agenda cambia aspetto visivo (es. compare un bordo nero per la conferma inviata e un bordo fucsia per il </w:t>
+        <w:t> Una volta inviata la conferma o il promemoria, l'appuntamento in agenda cambia aspetto visivo (es. compare un bordo</w:t>
+      </w:r>
+      <w:r>
+        <w:rPr>
+          <w:rStyle w:val="ng-star-inserted"/>
+          <w:rFonts w:ascii="Arial" w:hAnsi="Arial" w:cs="Arial"/>
+          <w:color w:val="1B1B1E"/>
+          <w:sz w:val="21"/>
+          <w:szCs w:val="21"/>
+        </w:rPr>
+        <w:t xml:space="preserve"> a sinistra</w:t>
+      </w:r>
+      <w:r>
+        <w:rPr>
+          <w:rStyle w:val="ng-star-inserted"/>
+          <w:rFonts w:ascii="Arial" w:hAnsi="Arial" w:cs="Arial"/>
+          <w:color w:val="1B1B1E"/>
+          <w:sz w:val="21"/>
+          <w:szCs w:val="21"/>
+        </w:rPr>
+        <w:t xml:space="preserve"> </w:t>
+      </w:r>
+      <w:r>
+        <w:rPr>
+          <w:rStyle w:val="ng-star-inserted"/>
+          <w:rFonts w:ascii="Arial" w:hAnsi="Arial" w:cs="Arial"/>
+          <w:color w:val="1B1B1E"/>
+          <w:sz w:val="21"/>
+          <w:szCs w:val="21"/>
+        </w:rPr>
+        <w:t>come indicato nella legenda in basso e un’icona</w:t>
+      </w:r>
+      <w:r>
+        <w:rPr>
+          <w:rStyle w:val="ng-star-inserted"/>
+          <w:rFonts w:ascii="Arial" w:hAnsi="Arial" w:cs="Arial"/>
+          <w:color w:val="1B1B1E"/>
+          <w:sz w:val="21"/>
+          <w:szCs w:val="21"/>
+        </w:rPr>
+        <w:t xml:space="preserve"> per la conferma </w:t>
+      </w:r>
+      <w:bookmarkStart w:id="0" w:name="_GoBack"/>
+      <w:bookmarkEnd w:id="0"/>
+      <w:r>
+        <w:rPr>
+          <w:rStyle w:val="ng-star-inserted"/>
+          <w:rFonts w:ascii="Arial" w:hAnsi="Arial" w:cs="Arial"/>
+          <w:color w:val="1B1B1E"/>
+          <w:sz w:val="21"/>
+          <w:szCs w:val="21"/>
+        </w:rPr>
+        <w:t xml:space="preserve">inviata e per il </w:t>
       </w:r>
       <w:proofErr w:type="spellStart"/>
       <w:r>
@@ -11328,7 +11369,6 @@
         </w:rPr>
         <w:t> </w:t>
       </w:r>
-      <w:proofErr w:type="spellStart"/>
       <w:r>
         <w:rPr>
           <w:rFonts w:ascii="Arial" w:eastAsia="Times New Roman" w:hAnsi="Arial" w:cs="Arial"/>
@@ -11351,7 +11391,6 @@
         </w:rPr>
         <w:t>.</w:t>
       </w:r>
-      <w:proofErr w:type="spellEnd"/>
     </w:p>
     <w:p>
       <w:pPr>
@@ -11369,8 +11408,6 @@
           <w:lang w:eastAsia="it-IT"/>
         </w:rPr>
       </w:pPr>
-      <w:bookmarkStart w:id="0" w:name="_GoBack"/>
-      <w:bookmarkEnd w:id="0"/>
       <w:r>
         <w:rPr>
           <w:rFonts w:ascii="Arial" w:eastAsia="Times New Roman" w:hAnsi="Arial" w:cs="Arial"/>

</xml_diff>